<commit_message>
re arranged the folder and file structure
</commit_message>
<xml_diff>
--- a/Assignment-01/DOL_01_Samartha_Sherestha(23070122189).docx
+++ b/Assignment-01/DOL_01_Samartha_Sherestha(23070122189).docx
@@ -1429,7 +1429,7 @@
                 <w:rFonts w:ascii="Times New Roman" w:eastAsia="Times New Roman" w:hAnsi="Times New Roman" w:cs="Times New Roman"/>
                 <w:color w:val="000000"/>
               </w:rPr>
-              <w:t xml:space="preserve">git clone https://github.com/riavinod10/devops-lab.git – Cloned the remote GitHub repository to the local machine. </w:t>
+              <w:t xml:space="preserve">git clone https://github.com/Samartha120/Devops-lab-Assignment.git – Cloned the remote GitHub repository to the local machine. </w:t>
             </w:r>
           </w:p>
           <w:p>
@@ -1790,7 +1790,7 @@
               </w:rPr>
               <w:drawing>
                 <wp:inline distT="0" distB="0" distL="0" distR="0" wp14:anchorId="0337F205" wp14:editId="144C4AA4">
-                  <wp:extent cx="4643755" cy="2067560"/>
+                  <wp:extent cx="4643755" cy="2352158"/>
                   <wp:effectExtent l="0" t="0" r="4445" b="8890"/>
                   <wp:docPr id="1" name="Picture 1"/>
                   <wp:cNvGraphicFramePr>
@@ -1812,7 +1812,7 @@
                         <pic:spPr>
                           <a:xfrm>
                             <a:off x="0" y="0"/>
-                            <a:ext cx="4643755" cy="2067560"/>
+                            <a:ext cx="4643755" cy="2352158"/>
                           </a:xfrm>
                           <a:prstGeom prst="rect">
                             <a:avLst/>
@@ -2523,68 +2523,6 @@
                 <w:szCs w:val="24"/>
               </w:rPr>
               <w:t>Step 7: Verify on GitHub</w:t>
-            </w:r>
-          </w:p>
-          <w:p>
-            <w:pPr>
-              <w:spacing w:before="240" w:after="100" w:afterAutospacing="1" w:line="240" w:lineRule="auto"/>
-              <w:rPr>
-                <w:rFonts w:ascii="Times New Roman" w:hAnsi="Times New Roman" w:cs="Times New Roman"/>
-                <w:color w:val="000000" w:themeColor="text1"/>
-                <w:sz w:val="24"/>
-                <w:szCs w:val="24"/>
-              </w:rPr>
-            </w:pPr>
-            <w:r>
-              <w:rPr>
-                <w:rFonts w:ascii="Times New Roman" w:hAnsi="Times New Roman" w:cs="Times New Roman"/>
-                <w:noProof/>
-                <w:color w:val="000000" w:themeColor="text1"/>
-                <w:sz w:val="24"/>
-                <w:szCs w:val="24"/>
-              </w:rPr>
-              <w:drawing>
-                <wp:inline distT="0" distB="0" distL="0" distR="0" wp14:anchorId="39AC7027" wp14:editId="3F76CF3B">
-                  <wp:extent cx="4643755" cy="1775502"/>
-                  <wp:effectExtent l="0" t="0" r="4445" b="0"/>
-                  <wp:docPr id="1789173801" name="Picture 1"/>
-                  <wp:cNvGraphicFramePr>
-                    <a:graphicFrameLocks xmlns:a="http://schemas.openxmlformats.org/drawingml/2006/main" noChangeAspect="1"/>
-                  </wp:cNvGraphicFramePr>
-                  <a:graphic xmlns:a="http://schemas.openxmlformats.org/drawingml/2006/main">
-                    <a:graphicData uri="http://schemas.openxmlformats.org/drawingml/2006/picture">
-                      <pic:pic xmlns:pic="http://schemas.openxmlformats.org/drawingml/2006/picture">
-                        <pic:nvPicPr>
-                          <pic:cNvPr id="1789173801" name=""/>
-                          <pic:cNvPicPr/>
-                        </pic:nvPicPr>
-                        <pic:blipFill rotWithShape="1">
-                          <a:blip r:embed="rId13"/>
-                          <a:srcRect t="5570"/>
-                          <a:stretch/>
-                        </pic:blipFill>
-                        <pic:spPr bwMode="auto">
-                          <a:xfrm>
-                            <a:off x="0" y="0"/>
-                            <a:ext cx="4643755" cy="1775502"/>
-                          </a:xfrm>
-                          <a:prstGeom prst="rect">
-                            <a:avLst/>
-                          </a:prstGeom>
-                          <a:ln>
-                            <a:noFill/>
-                          </a:ln>
-                          <a:extLst>
-                            <a:ext uri="{53640926-AAD7-44D8-BBD7-CCE9431645EC}">
-                              <a14:shadowObscured xmlns:a14="http://schemas.microsoft.com/office/drawing/2010/main"/>
-                            </a:ext>
-                          </a:extLst>
-                        </pic:spPr>
-                      </pic:pic>
-                    </a:graphicData>
-                  </a:graphic>
-                </wp:inline>
-              </w:drawing>
             </w:r>
           </w:p>
           <w:p>

</xml_diff>